<commit_message>
feat(cad): video Modul 2 versi klik GUI + teks langkah sesuai alat Draft; zoom Modul 1 dirapikan
- Video Praktik Terbimbing Modul 2 diganti (4:56 -> 8:40), memakai beragam alat Draft:
  - Rotate+Copy untuk sumbu Y dan sumbu 45 derajat;
  - snap Midpoint/Intersection;
  - Offset untuk lubang poros;
  - Polar Array dengan pusat diklik;
  - dimensi dengan klik titik potong.
  Layer: Kontur tebal (3), Dimensi tipis (1), Konstruksi abu-abu putus-putus dan tetap tampil;
  grid dimatikan.
- Teks langkah Modul 2 disesuaikan: urutan lubang baut sebelum kontur, sumbu +-80,
  lingkaran jarak tanpa face, dimensi bertingkat; Gambar 7 diperbarui (label 80 tidak
  lagi tertimpa busur sudut). Word/PDF dibangun ulang.
- Video Modul 1: caption ber-zoom dipecah agar zoom tidak memotong menu/klik.

Co-Authored-By: Claude Opus 5.5 <noreply@anthropic.com>
</commit_message>
<xml_diff>
--- a/Pemodelan-Computer-Aided-Design/Modul-Word/Modul-2-Drafting-dan-Penyuntingan-2D.docx
+++ b/Pemodelan-Computer-Aided-Design/Modul-Word/Modul-2-Drafting-dan-Penyuntingan-2D.docx
@@ -9963,7 +9963,7 @@
           <w:i w:val="0"/>
           <w:sz w:val="20"/>
         </w:rPr>
-        <w:t>Gambar 7 — Benda kerja praktik terbimbing: flens pelat delapan baut. Pandangan atas pada bidang Top (XY), satuan mm. Pusat flens berada di titik asal (0, 0). Lingkaran jarak dan garis sumbu dibuat pada langkah 2, kontur luar dan lubang poros pada langkah 3 (keduanya diketik sebagai radius), lubang induk berwarna hijau dan PolarArray pada langkah 4, sedangkan sudut antarsumbu lubang adalah dimensi angular langkah 6.</w:t>
+        <w:t>Gambar 7 — Benda kerja praktik terbimbing: flens pelat delapan baut. Pandangan atas pada bidang Top (XY), satuan mm. Pusat flens berada di titik asal (0, 0). Lingkaran jarak dan garis sumbu dibuat pada langkah 2, lubang induk berwarna hijau dan PolarArray pada langkah 3, kontur luar (radius diketik) dan lubang poros hasil Offset pada langkah 4, sedangkan sudut antarsumbu lubang adalah dimensi angular langkah 6.</w:t>
       </w:r>
     </w:p>
     <w:p>
@@ -9996,7 +9996,61 @@
           <w:i w:val="0"/>
           <w:sz w:val="22"/>
         </w:rPr>
-        <w:t>Ctrl+N, workbench Draft, working plane Top (XY), satuan mm. Buat layer Kontur, Dimensi, dan Konstruksi (Draft → Layer, ganti nama di properti Label).</w:t>
+        <w:t xml:space="preserve">File → New Document, workbench Draft, working plane Top (XY), satuan mm. Aktifkan snap Endpoint, Midpoint, Center, dan Intersection; matikan grid (Utilities → Toggle Grid). Buat layer Kontur, Dimensi, dan Konstruksi (Utilities → New Layer, ganti nama di properti Label), lalu atur di tab View: Kontur </w:t>
+      </w:r>
+      <w:r>
+        <w:rPr>
+          <w:rFonts w:ascii="Arial" w:hAnsi="Arial" w:eastAsia="Arial" w:cs="Arial"/>
+          <w:b w:val="0"/>
+          <w:i/>
+          <w:sz w:val="22"/>
+        </w:rPr>
+        <w:t>Line Width</w:t>
+      </w:r>
+      <w:r>
+        <w:rPr>
+          <w:rFonts w:ascii="Arial" w:hAnsi="Arial" w:eastAsia="Arial" w:cs="Arial"/>
+          <w:b w:val="0"/>
+          <w:i w:val="0"/>
+          <w:sz w:val="22"/>
+        </w:rPr>
+        <w:t xml:space="preserve"> 3; Dimensi 1; Konstruksi 1, </w:t>
+      </w:r>
+      <w:r>
+        <w:rPr>
+          <w:rFonts w:ascii="Arial" w:hAnsi="Arial" w:eastAsia="Arial" w:cs="Arial"/>
+          <w:b w:val="0"/>
+          <w:i/>
+          <w:sz w:val="22"/>
+        </w:rPr>
+        <w:t>Draw Style</w:t>
+      </w:r>
+      <w:r>
+        <w:rPr>
+          <w:rFonts w:ascii="Arial" w:hAnsi="Arial" w:eastAsia="Arial" w:cs="Arial"/>
+          <w:b w:val="0"/>
+          <w:i w:val="0"/>
+          <w:sz w:val="22"/>
+        </w:rPr>
+        <w:t xml:space="preserve"> Dashed, </w:t>
+      </w:r>
+      <w:r>
+        <w:rPr>
+          <w:rFonts w:ascii="Arial" w:hAnsi="Arial" w:eastAsia="Arial" w:cs="Arial"/>
+          <w:b w:val="0"/>
+          <w:i/>
+          <w:sz w:val="22"/>
+        </w:rPr>
+        <w:t>Line Color</w:t>
+      </w:r>
+      <w:r>
+        <w:rPr>
+          <w:rFonts w:ascii="Arial" w:hAnsi="Arial" w:eastAsia="Arial" w:cs="Arial"/>
+          <w:b w:val="0"/>
+          <w:i w:val="0"/>
+          <w:sz w:val="22"/>
+        </w:rPr>
+        <w:t xml:space="preserve"> abu-abu (#8c8c8c).</w:t>
       </w:r>
     </w:p>
     <w:p>
@@ -10029,7 +10083,43 @@
           <w:i w:val="0"/>
           <w:sz w:val="22"/>
         </w:rPr>
-        <w:t>Nyalakan Construction mode. Draft Circle radius 50 mm di titik asal sebagai lingkaran jarak (PCD 100), dan dua Draft Line sumbu X dan Y sepanjang ±100 mm. Matikan Construction mode.</w:t>
+        <w:t xml:space="preserve">Nyalakan Construction mode. Draft Line sumbu X dari (−80, 0) ke (80, 0). Sumbu Y: </w:t>
+      </w:r>
+      <w:r>
+        <w:rPr>
+          <w:rFonts w:ascii="Arial" w:hAnsi="Arial" w:eastAsia="Arial" w:cs="Arial"/>
+          <w:b/>
+          <w:i w:val="0"/>
+          <w:sz w:val="22"/>
+        </w:rPr>
+        <w:t>Rotate</w:t>
+      </w:r>
+      <w:r>
+        <w:rPr>
+          <w:rFonts w:ascii="Arial" w:hAnsi="Arial" w:eastAsia="Arial" w:cs="Arial"/>
+          <w:b w:val="0"/>
+          <w:i w:val="0"/>
+          <w:sz w:val="22"/>
+        </w:rPr>
+        <w:t xml:space="preserve"> + Copy sumbu X sebesar 90° dengan pusat diklik di titik tengahnya (snap Midpoint). Lingkaran jarak: Draft Circle dengan pusat diklik di perpotongan sumbu, radius 50 mm (PCD 100), </w:t>
+      </w:r>
+      <w:r>
+        <w:rPr>
+          <w:rFonts w:ascii="Arial" w:hAnsi="Arial" w:eastAsia="Arial" w:cs="Arial"/>
+          <w:b w:val="0"/>
+          <w:i/>
+          <w:sz w:val="22"/>
+        </w:rPr>
+        <w:t>Make face</w:t>
+      </w:r>
+      <w:r>
+        <w:rPr>
+          <w:rFonts w:ascii="Arial" w:hAnsi="Arial" w:eastAsia="Arial" w:cs="Arial"/>
+          <w:b w:val="0"/>
+          <w:i w:val="0"/>
+          <w:sz w:val="22"/>
+        </w:rPr>
+        <w:t xml:space="preserve"> dimatikan karena hanya acuan. Matikan Construction mode dan masukkan ketiganya ke layer Konstruksi (Utilities → Add to Layer).</w:t>
       </w:r>
     </w:p>
     <w:p>
@@ -10053,16 +10143,16 @@
           <w:i w:val="0"/>
           <w:sz w:val="22"/>
         </w:rPr>
-        <w:t xml:space="preserve">Kontur flens: </w:t>
-      </w:r>
-      <w:r>
-        <w:rPr>
-          <w:rFonts w:ascii="Arial" w:hAnsi="Arial" w:eastAsia="Arial" w:cs="Arial"/>
-          <w:b w:val="0"/>
-          <w:i w:val="0"/>
-          <w:sz w:val="22"/>
-        </w:rPr>
-        <w:t>Draft Circle radius 70 mm (kontur luar) dan radius 25 mm (lubang poros) di titik asal, Make Face aktif. Masukkan keduanya ke layer Kontur.</w:t>
+        <w:t xml:space="preserve">Lubang baut: </w:t>
+      </w:r>
+      <w:r>
+        <w:rPr>
+          <w:rFonts w:ascii="Arial" w:hAnsi="Arial" w:eastAsia="Arial" w:cs="Arial"/>
+          <w:b w:val="0"/>
+          <w:i w:val="0"/>
+          <w:sz w:val="22"/>
+        </w:rPr>
+        <w:t>Draft Circle ⌀10: pusat diklik di perpotongan lingkaran jarak dan sumbu X dengan snap Intersection (lewatkan kursor dulu di lingkaran jarak, lalu arahkan ke sumbu X) → (50, 0). Modification → Array Tools → Polar Array: 8 salinan, 360°, pusat diklik di titik asal. Masukkan Array ke layer Kontur.</w:t>
       </w:r>
     </w:p>
     <w:p>
@@ -10086,16 +10176,34 @@
           <w:i w:val="0"/>
           <w:sz w:val="22"/>
         </w:rPr>
-        <w:t xml:space="preserve">Lubang baut: </w:t>
-      </w:r>
-      <w:r>
-        <w:rPr>
-          <w:rFonts w:ascii="Arial" w:hAnsi="Arial" w:eastAsia="Arial" w:cs="Arial"/>
-          <w:b w:val="0"/>
-          <w:i w:val="0"/>
-          <w:sz w:val="22"/>
-        </w:rPr>
-        <w:t>Draft Circle ⌀10 berpusat di (50, 0) memakai snap Intersection lingkaran jarak dan sumbu X. Draft → PolarArray: 8 salinan, 360°, pusat (0, 0, 0).</w:t>
+        <w:t xml:space="preserve">Kontur flens: </w:t>
+      </w:r>
+      <w:r>
+        <w:rPr>
+          <w:rFonts w:ascii="Arial" w:hAnsi="Arial" w:eastAsia="Arial" w:cs="Arial"/>
+          <w:b w:val="0"/>
+          <w:i w:val="0"/>
+          <w:sz w:val="22"/>
+        </w:rPr>
+        <w:t xml:space="preserve">Draft Circle radius 70 mm dengan pusat diklik di titik asal (kontur luar, Make Face aktif). Lubang poros: </w:t>
+      </w:r>
+      <w:r>
+        <w:rPr>
+          <w:rFonts w:ascii="Arial" w:hAnsi="Arial" w:eastAsia="Arial" w:cs="Arial"/>
+          <w:b/>
+          <w:i w:val="0"/>
+          <w:sz w:val="22"/>
+        </w:rPr>
+        <w:t>Offset</w:t>
+      </w:r>
+      <w:r>
+        <w:rPr>
+          <w:rFonts w:ascii="Arial" w:hAnsi="Arial" w:eastAsia="Arial" w:cs="Arial"/>
+          <w:b w:val="0"/>
+          <w:i w:val="0"/>
+          <w:sz w:val="22"/>
+        </w:rPr>
+        <w:t xml:space="preserve"> + Copy kontur luar 45 mm ke dalam — kursor berada di dalam lingkaran saat jarak diketik — menghasilkan radius 25 mm. Masukkan keduanya ke layer Kontur.</w:t>
       </w:r>
     </w:p>
     <w:p>
@@ -10128,7 +10236,7 @@
           <w:i w:val="0"/>
           <w:sz w:val="22"/>
         </w:rPr>
-        <w:t>Part → Boolean → Cut: kontur luar − lubang poros, lalu hasilnya − Array. Sembunyikan objek antara (Spasi); periksa Shape.Area di Python console.</w:t>
+        <w:t>Part → Boolean → Cut: kontur luar − lubang poros, lalu hasilnya − Array (jawab Yes pada peringatan objek non-solid). Periksa Shape.Area di Python console.</w:t>
       </w:r>
     </w:p>
     <w:p>
@@ -10161,7 +10269,25 @@
           <w:i w:val="0"/>
           <w:sz w:val="22"/>
         </w:rPr>
-        <w:t>Pada layer Dimensi: Draft Dimension diameter kontur luar dan lubang poros, radius lingkaran jarak (dari layer Konstruksi), dan angular 360°/8 = 45° antara dua sumbu lubang bertetangga.</w:t>
+        <w:t xml:space="preserve">Kembali ke Draft; masukkan Cut001 ke layer Kontur. Sumbu lubang kedua: Rotate + Copy sumbu X sebesar 45° (Construction mode, layer Konstruksi). Pada layer Dimensi, Draft Dimension dengan klik titik potong (snap Intersection): lubang poros dengan sumbu X (Ø50) dan kontur luar dengan sumbu X (Ø140), keduanya bertingkat di bawah benda, melewati ujung sumbu; lalu titik asal dan pusat lubang kedua pada sumbu 45° (R50). Teks diganti lewat properti </w:t>
+      </w:r>
+      <w:r>
+        <w:rPr>
+          <w:rFonts w:ascii="Arial" w:hAnsi="Arial" w:eastAsia="Arial" w:cs="Arial"/>
+          <w:b w:val="0"/>
+          <w:i/>
+          <w:sz w:val="22"/>
+        </w:rPr>
+        <w:t>Override</w:t>
+      </w:r>
+      <w:r>
+        <w:rPr>
+          <w:rFonts w:ascii="Arial" w:hAnsi="Arial" w:eastAsia="Arial" w:cs="Arial"/>
+          <w:b w:val="0"/>
+          <w:i w:val="0"/>
+          <w:sz w:val="22"/>
+        </w:rPr>
+        <w:t>. Sudut 45°: Select Edge pada sumbu X, Alt+klik sumbu kedua, letakkan busurnya di luar ujung sumbu. Tidak boleh ada angka atau garis dimensi yang menimpa garis lain.</w:t>
       </w:r>
     </w:p>
     <w:p>
@@ -10194,7 +10320,7 @@
           <w:i w:val="0"/>
           <w:sz w:val="22"/>
         </w:rPr>
-        <w:t>Sembunyikan layer Konstruksi, V lalu F, Ctrl+S → Latihan2_NIM.FCStd. Coba File → Export → DXF dan buka kembali untuk melihat layer-nya terbawa.</w:t>
+        <w:t>Layer Konstruksi tetap tampil sebagai garis sumbu abu-abu putus-putus (sembunyikan hanya saat mengekspor DXF untuk mesin potong). V lalu F, Ctrl+S → Latihan2_NIM.FCStd. Coba File → Export → DXF dan buka kembali untuk melihat layer-nya terbawa.</w:t>
       </w:r>
     </w:p>
     <w:p>

</xml_diff>

<commit_message>
feat(cad): video Modul 2 versi klik GUI + teks langkah sesuai alat Draft; zoom Modul 1 dirapikan (#1037)
- Video Praktik Terbimbing Modul 2 diganti (4:56 -> 8:40), memakai beragam alat Draft:
  - Rotate+Copy untuk sumbu Y dan sumbu 45 derajat;
  - snap Midpoint/Intersection;
  - Offset untuk lubang poros;
  - Polar Array dengan pusat diklik;
  - dimensi dengan klik titik potong.
  Layer: Kontur tebal (3), Dimensi tipis (1), Konstruksi abu-abu putus-putus dan tetap tampil;
  grid dimatikan.
- Teks langkah Modul 2 disesuaikan: urutan lubang baut sebelum kontur, sumbu +-80,
  lingkaran jarak tanpa face, dimensi bertingkat; Gambar 7 diperbarui (label 80 tidak
  lagi tertimpa busur sudut). Word/PDF dibangun ulang.
- Video Modul 1: caption ber-zoom dipecah agar zoom tidak memotong menu/klik.

Co-authored-by: Claude Opus 5.5 <noreply@anthropic.com>
</commit_message>
<xml_diff>
--- a/Pemodelan-Computer-Aided-Design/Modul-Word/Modul-2-Drafting-dan-Penyuntingan-2D.docx
+++ b/Pemodelan-Computer-Aided-Design/Modul-Word/Modul-2-Drafting-dan-Penyuntingan-2D.docx
@@ -9963,7 +9963,7 @@
           <w:i w:val="0"/>
           <w:sz w:val="20"/>
         </w:rPr>
-        <w:t>Gambar 7 — Benda kerja praktik terbimbing: flens pelat delapan baut. Pandangan atas pada bidang Top (XY), satuan mm. Pusat flens berada di titik asal (0, 0). Lingkaran jarak dan garis sumbu dibuat pada langkah 2, kontur luar dan lubang poros pada langkah 3 (keduanya diketik sebagai radius), lubang induk berwarna hijau dan PolarArray pada langkah 4, sedangkan sudut antarsumbu lubang adalah dimensi angular langkah 6.</w:t>
+        <w:t>Gambar 7 — Benda kerja praktik terbimbing: flens pelat delapan baut. Pandangan atas pada bidang Top (XY), satuan mm. Pusat flens berada di titik asal (0, 0). Lingkaran jarak dan garis sumbu dibuat pada langkah 2, lubang induk berwarna hijau dan PolarArray pada langkah 3, kontur luar (radius diketik) dan lubang poros hasil Offset pada langkah 4, sedangkan sudut antarsumbu lubang adalah dimensi angular langkah 6.</w:t>
       </w:r>
     </w:p>
     <w:p>
@@ -9996,7 +9996,61 @@
           <w:i w:val="0"/>
           <w:sz w:val="22"/>
         </w:rPr>
-        <w:t>Ctrl+N, workbench Draft, working plane Top (XY), satuan mm. Buat layer Kontur, Dimensi, dan Konstruksi (Draft → Layer, ganti nama di properti Label).</w:t>
+        <w:t xml:space="preserve">File → New Document, workbench Draft, working plane Top (XY), satuan mm. Aktifkan snap Endpoint, Midpoint, Center, dan Intersection; matikan grid (Utilities → Toggle Grid). Buat layer Kontur, Dimensi, dan Konstruksi (Utilities → New Layer, ganti nama di properti Label), lalu atur di tab View: Kontur </w:t>
+      </w:r>
+      <w:r>
+        <w:rPr>
+          <w:rFonts w:ascii="Arial" w:hAnsi="Arial" w:eastAsia="Arial" w:cs="Arial"/>
+          <w:b w:val="0"/>
+          <w:i/>
+          <w:sz w:val="22"/>
+        </w:rPr>
+        <w:t>Line Width</w:t>
+      </w:r>
+      <w:r>
+        <w:rPr>
+          <w:rFonts w:ascii="Arial" w:hAnsi="Arial" w:eastAsia="Arial" w:cs="Arial"/>
+          <w:b w:val="0"/>
+          <w:i w:val="0"/>
+          <w:sz w:val="22"/>
+        </w:rPr>
+        <w:t xml:space="preserve"> 3; Dimensi 1; Konstruksi 1, </w:t>
+      </w:r>
+      <w:r>
+        <w:rPr>
+          <w:rFonts w:ascii="Arial" w:hAnsi="Arial" w:eastAsia="Arial" w:cs="Arial"/>
+          <w:b w:val="0"/>
+          <w:i/>
+          <w:sz w:val="22"/>
+        </w:rPr>
+        <w:t>Draw Style</w:t>
+      </w:r>
+      <w:r>
+        <w:rPr>
+          <w:rFonts w:ascii="Arial" w:hAnsi="Arial" w:eastAsia="Arial" w:cs="Arial"/>
+          <w:b w:val="0"/>
+          <w:i w:val="0"/>
+          <w:sz w:val="22"/>
+        </w:rPr>
+        <w:t xml:space="preserve"> Dashed, </w:t>
+      </w:r>
+      <w:r>
+        <w:rPr>
+          <w:rFonts w:ascii="Arial" w:hAnsi="Arial" w:eastAsia="Arial" w:cs="Arial"/>
+          <w:b w:val="0"/>
+          <w:i/>
+          <w:sz w:val="22"/>
+        </w:rPr>
+        <w:t>Line Color</w:t>
+      </w:r>
+      <w:r>
+        <w:rPr>
+          <w:rFonts w:ascii="Arial" w:hAnsi="Arial" w:eastAsia="Arial" w:cs="Arial"/>
+          <w:b w:val="0"/>
+          <w:i w:val="0"/>
+          <w:sz w:val="22"/>
+        </w:rPr>
+        <w:t xml:space="preserve"> abu-abu (#8c8c8c).</w:t>
       </w:r>
     </w:p>
     <w:p>
@@ -10029,7 +10083,43 @@
           <w:i w:val="0"/>
           <w:sz w:val="22"/>
         </w:rPr>
-        <w:t>Nyalakan Construction mode. Draft Circle radius 50 mm di titik asal sebagai lingkaran jarak (PCD 100), dan dua Draft Line sumbu X dan Y sepanjang ±100 mm. Matikan Construction mode.</w:t>
+        <w:t xml:space="preserve">Nyalakan Construction mode. Draft Line sumbu X dari (−80, 0) ke (80, 0). Sumbu Y: </w:t>
+      </w:r>
+      <w:r>
+        <w:rPr>
+          <w:rFonts w:ascii="Arial" w:hAnsi="Arial" w:eastAsia="Arial" w:cs="Arial"/>
+          <w:b/>
+          <w:i w:val="0"/>
+          <w:sz w:val="22"/>
+        </w:rPr>
+        <w:t>Rotate</w:t>
+      </w:r>
+      <w:r>
+        <w:rPr>
+          <w:rFonts w:ascii="Arial" w:hAnsi="Arial" w:eastAsia="Arial" w:cs="Arial"/>
+          <w:b w:val="0"/>
+          <w:i w:val="0"/>
+          <w:sz w:val="22"/>
+        </w:rPr>
+        <w:t xml:space="preserve"> + Copy sumbu X sebesar 90° dengan pusat diklik di titik tengahnya (snap Midpoint). Lingkaran jarak: Draft Circle dengan pusat diklik di perpotongan sumbu, radius 50 mm (PCD 100), </w:t>
+      </w:r>
+      <w:r>
+        <w:rPr>
+          <w:rFonts w:ascii="Arial" w:hAnsi="Arial" w:eastAsia="Arial" w:cs="Arial"/>
+          <w:b w:val="0"/>
+          <w:i/>
+          <w:sz w:val="22"/>
+        </w:rPr>
+        <w:t>Make face</w:t>
+      </w:r>
+      <w:r>
+        <w:rPr>
+          <w:rFonts w:ascii="Arial" w:hAnsi="Arial" w:eastAsia="Arial" w:cs="Arial"/>
+          <w:b w:val="0"/>
+          <w:i w:val="0"/>
+          <w:sz w:val="22"/>
+        </w:rPr>
+        <w:t xml:space="preserve"> dimatikan karena hanya acuan. Matikan Construction mode dan masukkan ketiganya ke layer Konstruksi (Utilities → Add to Layer).</w:t>
       </w:r>
     </w:p>
     <w:p>
@@ -10053,16 +10143,16 @@
           <w:i w:val="0"/>
           <w:sz w:val="22"/>
         </w:rPr>
-        <w:t xml:space="preserve">Kontur flens: </w:t>
-      </w:r>
-      <w:r>
-        <w:rPr>
-          <w:rFonts w:ascii="Arial" w:hAnsi="Arial" w:eastAsia="Arial" w:cs="Arial"/>
-          <w:b w:val="0"/>
-          <w:i w:val="0"/>
-          <w:sz w:val="22"/>
-        </w:rPr>
-        <w:t>Draft Circle radius 70 mm (kontur luar) dan radius 25 mm (lubang poros) di titik asal, Make Face aktif. Masukkan keduanya ke layer Kontur.</w:t>
+        <w:t xml:space="preserve">Lubang baut: </w:t>
+      </w:r>
+      <w:r>
+        <w:rPr>
+          <w:rFonts w:ascii="Arial" w:hAnsi="Arial" w:eastAsia="Arial" w:cs="Arial"/>
+          <w:b w:val="0"/>
+          <w:i w:val="0"/>
+          <w:sz w:val="22"/>
+        </w:rPr>
+        <w:t>Draft Circle ⌀10: pusat diklik di perpotongan lingkaran jarak dan sumbu X dengan snap Intersection (lewatkan kursor dulu di lingkaran jarak, lalu arahkan ke sumbu X) → (50, 0). Modification → Array Tools → Polar Array: 8 salinan, 360°, pusat diklik di titik asal. Masukkan Array ke layer Kontur.</w:t>
       </w:r>
     </w:p>
     <w:p>
@@ -10086,16 +10176,34 @@
           <w:i w:val="0"/>
           <w:sz w:val="22"/>
         </w:rPr>
-        <w:t xml:space="preserve">Lubang baut: </w:t>
-      </w:r>
-      <w:r>
-        <w:rPr>
-          <w:rFonts w:ascii="Arial" w:hAnsi="Arial" w:eastAsia="Arial" w:cs="Arial"/>
-          <w:b w:val="0"/>
-          <w:i w:val="0"/>
-          <w:sz w:val="22"/>
-        </w:rPr>
-        <w:t>Draft Circle ⌀10 berpusat di (50, 0) memakai snap Intersection lingkaran jarak dan sumbu X. Draft → PolarArray: 8 salinan, 360°, pusat (0, 0, 0).</w:t>
+        <w:t xml:space="preserve">Kontur flens: </w:t>
+      </w:r>
+      <w:r>
+        <w:rPr>
+          <w:rFonts w:ascii="Arial" w:hAnsi="Arial" w:eastAsia="Arial" w:cs="Arial"/>
+          <w:b w:val="0"/>
+          <w:i w:val="0"/>
+          <w:sz w:val="22"/>
+        </w:rPr>
+        <w:t xml:space="preserve">Draft Circle radius 70 mm dengan pusat diklik di titik asal (kontur luar, Make Face aktif). Lubang poros: </w:t>
+      </w:r>
+      <w:r>
+        <w:rPr>
+          <w:rFonts w:ascii="Arial" w:hAnsi="Arial" w:eastAsia="Arial" w:cs="Arial"/>
+          <w:b/>
+          <w:i w:val="0"/>
+          <w:sz w:val="22"/>
+        </w:rPr>
+        <w:t>Offset</w:t>
+      </w:r>
+      <w:r>
+        <w:rPr>
+          <w:rFonts w:ascii="Arial" w:hAnsi="Arial" w:eastAsia="Arial" w:cs="Arial"/>
+          <w:b w:val="0"/>
+          <w:i w:val="0"/>
+          <w:sz w:val="22"/>
+        </w:rPr>
+        <w:t xml:space="preserve"> + Copy kontur luar 45 mm ke dalam — kursor berada di dalam lingkaran saat jarak diketik — menghasilkan radius 25 mm. Masukkan keduanya ke layer Kontur.</w:t>
       </w:r>
     </w:p>
     <w:p>
@@ -10128,7 +10236,7 @@
           <w:i w:val="0"/>
           <w:sz w:val="22"/>
         </w:rPr>
-        <w:t>Part → Boolean → Cut: kontur luar − lubang poros, lalu hasilnya − Array. Sembunyikan objek antara (Spasi); periksa Shape.Area di Python console.</w:t>
+        <w:t>Part → Boolean → Cut: kontur luar − lubang poros, lalu hasilnya − Array (jawab Yes pada peringatan objek non-solid). Periksa Shape.Area di Python console.</w:t>
       </w:r>
     </w:p>
     <w:p>
@@ -10161,7 +10269,25 @@
           <w:i w:val="0"/>
           <w:sz w:val="22"/>
         </w:rPr>
-        <w:t>Pada layer Dimensi: Draft Dimension diameter kontur luar dan lubang poros, radius lingkaran jarak (dari layer Konstruksi), dan angular 360°/8 = 45° antara dua sumbu lubang bertetangga.</w:t>
+        <w:t xml:space="preserve">Kembali ke Draft; masukkan Cut001 ke layer Kontur. Sumbu lubang kedua: Rotate + Copy sumbu X sebesar 45° (Construction mode, layer Konstruksi). Pada layer Dimensi, Draft Dimension dengan klik titik potong (snap Intersection): lubang poros dengan sumbu X (Ø50) dan kontur luar dengan sumbu X (Ø140), keduanya bertingkat di bawah benda, melewati ujung sumbu; lalu titik asal dan pusat lubang kedua pada sumbu 45° (R50). Teks diganti lewat properti </w:t>
+      </w:r>
+      <w:r>
+        <w:rPr>
+          <w:rFonts w:ascii="Arial" w:hAnsi="Arial" w:eastAsia="Arial" w:cs="Arial"/>
+          <w:b w:val="0"/>
+          <w:i/>
+          <w:sz w:val="22"/>
+        </w:rPr>
+        <w:t>Override</w:t>
+      </w:r>
+      <w:r>
+        <w:rPr>
+          <w:rFonts w:ascii="Arial" w:hAnsi="Arial" w:eastAsia="Arial" w:cs="Arial"/>
+          <w:b w:val="0"/>
+          <w:i w:val="0"/>
+          <w:sz w:val="22"/>
+        </w:rPr>
+        <w:t>. Sudut 45°: Select Edge pada sumbu X, Alt+klik sumbu kedua, letakkan busurnya di luar ujung sumbu. Tidak boleh ada angka atau garis dimensi yang menimpa garis lain.</w:t>
       </w:r>
     </w:p>
     <w:p>
@@ -10194,7 +10320,7 @@
           <w:i w:val="0"/>
           <w:sz w:val="22"/>
         </w:rPr>
-        <w:t>Sembunyikan layer Konstruksi, V lalu F, Ctrl+S → Latihan2_NIM.FCStd. Coba File → Export → DXF dan buka kembali untuk melihat layer-nya terbawa.</w:t>
+        <w:t>Layer Konstruksi tetap tampil sebagai garis sumbu abu-abu putus-putus (sembunyikan hanya saat mengekspor DXF untuk mesin potong). V lalu F, Ctrl+S → Latihan2_NIM.FCStd. Coba File → Export → DXF dan buka kembali untuk melihat layer-nya terbawa.</w:t>
       </w:r>
     </w:p>
     <w:p>

</xml_diff>